<commit_message>
Lock pilot decisions and add execution task list
</commit_message>
<xml_diff>
--- a/doc/human/SB-00_Business_Roadmap_v1_1.docx
+++ b/doc/human/SB-00_Business_Roadmap_v1_1.docx
@@ -140,79 +140,7 @@
           <w:i w:val="0"/>
           <w:sz w:val="32"/>
         </w:rPr>
-        <w:t xml:space="preserve"> เอกสารนี้อ้างอิงสมมติฐานกลางใน SB-00</w:t>
-      </w:r>
-      <w:r>
-        <w:rPr>
-          <w:rFonts w:ascii="TH Sarabun New" w:hAnsi="TH Sarabun New" w:eastAsia="TH Sarabun New" w:cs="TH Sarabun New"/>
-          <w:b w:val="0"/>
-          <w:i/>
-          <w:sz w:val="32"/>
-        </w:rPr>
-        <w:t>Master</w:t>
-      </w:r>
-      <w:r>
-        <w:rPr>
-          <w:rFonts w:ascii="TH Sarabun New" w:hAnsi="TH Sarabun New" w:eastAsia="TH Sarabun New" w:cs="TH Sarabun New"/>
-          <w:b w:val="0"/>
-          <w:i w:val="0"/>
-          <w:sz w:val="32"/>
-        </w:rPr>
-        <w:t>Assumptions</w:t>
-      </w:r>
-      <w:r>
-        <w:rPr>
-          <w:rFonts w:ascii="TH Sarabun New" w:hAnsi="TH Sarabun New" w:eastAsia="TH Sarabun New" w:cs="TH Sarabun New"/>
-          <w:b w:val="0"/>
-          <w:i/>
-          <w:sz w:val="32"/>
-        </w:rPr>
-        <w:t>v1</w:t>
-      </w:r>
-      <w:r>
-        <w:rPr>
-          <w:rFonts w:ascii="TH Sarabun New" w:hAnsi="TH Sarabun New" w:eastAsia="TH Sarabun New" w:cs="TH Sarabun New"/>
-          <w:b w:val="0"/>
-          <w:i w:val="0"/>
-          <w:sz w:val="32"/>
-        </w:rPr>
-        <w:t>1.md (./SB-00</w:t>
-      </w:r>
-      <w:r>
-        <w:rPr>
-          <w:rFonts w:ascii="TH Sarabun New" w:hAnsi="TH Sarabun New" w:eastAsia="TH Sarabun New" w:cs="TH Sarabun New"/>
-          <w:b w:val="0"/>
-          <w:i/>
-          <w:sz w:val="32"/>
-        </w:rPr>
-        <w:t>Master</w:t>
-      </w:r>
-      <w:r>
-        <w:rPr>
-          <w:rFonts w:ascii="TH Sarabun New" w:hAnsi="TH Sarabun New" w:eastAsia="TH Sarabun New" w:cs="TH Sarabun New"/>
-          <w:b w:val="0"/>
-          <w:i w:val="0"/>
-          <w:sz w:val="32"/>
-        </w:rPr>
-        <w:t>Assumptions</w:t>
-      </w:r>
-      <w:r>
-        <w:rPr>
-          <w:rFonts w:ascii="TH Sarabun New" w:hAnsi="TH Sarabun New" w:eastAsia="TH Sarabun New" w:cs="TH Sarabun New"/>
-          <w:b w:val="0"/>
-          <w:i/>
-          <w:sz w:val="32"/>
-        </w:rPr>
-        <w:t>v1</w:t>
-      </w:r>
-      <w:r>
-        <w:rPr>
-          <w:rFonts w:ascii="TH Sarabun New" w:hAnsi="TH Sarabun New" w:eastAsia="TH Sarabun New" w:cs="TH Sarabun New"/>
-          <w:b w:val="0"/>
-          <w:i w:val="0"/>
-          <w:sz w:val="32"/>
-        </w:rPr>
-        <w:t xml:space="preserve">1.md) | </w:t>
+        <w:t xml:space="preserve"> เอกสารนี้อ้างอิงสมมติฐานกลางใน SB-00_Master_Assumptions_v1_1.md (./SB-00_Master_Assumptions_v1_1.md) | </w:t>
       </w:r>
       <w:r>
         <w:rPr>
@@ -2202,17 +2130,7 @@
         <w:t xml:space="preserve"> ชัดเจน เพื่อไม่ให้ใช้ dev board ไปปนกับต้นทุนขายจริง</w:t>
       </w:r>
     </w:p>
-    <w:p>
-      <w:r>
-        <w:rPr>
-          <w:rFonts w:ascii="TH Sarabun New" w:hAnsi="TH Sarabun New" w:eastAsia="TH Sarabun New" w:cs="TH Sarabun New"/>
-          <w:b w:val="0"/>
-          <w:i w:val="0"/>
-          <w:sz w:val="32"/>
-        </w:rPr>
-        <w:t>&gt;</w:t>
-      </w:r>
-    </w:p>
+    <w:p/>
     <w:p>
       <w:pPr>
         <w:ind w:left="360"/>

</xml_diff>

<commit_message>
Regenerate human docs and remove Word lock file
</commit_message>
<xml_diff>
--- a/doc/human/SB-00_Business_Roadmap_v1_1.docx
+++ b/doc/human/SB-00_Business_Roadmap_v1_1.docx
@@ -10464,7 +10464,7 @@
                 <w:i w:val="0"/>
                 <w:sz w:val="32"/>
               </w:rPr>
-              <w:t>Firmware: BLE provisioning + error recovery + payment API + self-pentest</w:t>
+              <w:t>Firmware: provisioning hardening (QR/Web), error recovery + payment API + self-pentest</w:t>
             </w:r>
           </w:p>
         </w:tc>
@@ -10596,7 +10596,7 @@
           <w:i w:val="0"/>
           <w:sz w:val="32"/>
         </w:rPr>
-        <w:t>Firmware ครบทุก function: sensor, MQTT, OTA, BLE, sleep, watchdog, buffer, safe mode</w:t>
+        <w:t>Firmware ครบทุก function: sensor, MQTT, OTA, sleep, watchdog, buffer, safe mode</w:t>
       </w:r>
     </w:p>
     <w:p>

</xml_diff>

<commit_message>
Add modular battery platform docs for Standard and Long-Life
</commit_message>
<xml_diff>
--- a/doc/human/SB-00_Business_Roadmap_v1_1.docx
+++ b/doc/human/SB-00_Business_Roadmap_v1_1.docx
@@ -67,7 +67,7 @@
           <w:i w:val="0"/>
           <w:sz w:val="28"/>
         </w:rPr>
-        <w:t>Generated on: 2026-04-02</w:t>
+        <w:t>Generated on: 2026-04-03</w:t>
       </w:r>
     </w:p>
     <w:p>
@@ -2447,12 +2447,39 @@
           <w:p>
             <w:r>
               <w:rPr>
-                <w:rFonts w:ascii="TH Sarabun New" w:hAnsi="TH Sarabun New" w:eastAsia="TH Sarabun New" w:cs="TH Sarabun New"/>
-                <w:b w:val="0"/>
-                <w:i w:val="0"/>
-                <w:sz w:val="32"/>
-              </w:rPr>
-              <w:t>18650 x2 + holder/charger</w:t>
+                <w:rFonts w:ascii="Consolas" w:hAnsi="Consolas" w:eastAsia="Consolas" w:cs="Consolas"/>
+                <w:b w:val="0"/>
+                <w:i w:val="0"/>
+                <w:sz w:val="20"/>
+              </w:rPr>
+              <w:t>Standard</w:t>
+            </w:r>
+            <w:r>
+              <w:rPr>
+                <w:rFonts w:ascii="TH Sarabun New" w:hAnsi="TH Sarabun New" w:eastAsia="TH Sarabun New" w:cs="TH Sarabun New"/>
+                <w:b w:val="0"/>
+                <w:i w:val="0"/>
+                <w:sz w:val="32"/>
+              </w:rPr>
+              <w:t xml:space="preserve">: 18650 x2 + holder/charger / </w:t>
+            </w:r>
+            <w:r>
+              <w:rPr>
+                <w:rFonts w:ascii="Consolas" w:hAnsi="Consolas" w:eastAsia="Consolas" w:cs="Consolas"/>
+                <w:b w:val="0"/>
+                <w:i w:val="0"/>
+                <w:sz w:val="20"/>
+              </w:rPr>
+              <w:t>Long-Life</w:t>
+            </w:r>
+            <w:r>
+              <w:rPr>
+                <w:rFonts w:ascii="TH Sarabun New" w:hAnsi="TH Sarabun New" w:eastAsia="TH Sarabun New" w:cs="TH Sarabun New"/>
+                <w:b w:val="0"/>
+                <w:i w:val="0"/>
+                <w:sz w:val="32"/>
+              </w:rPr>
+              <w:t>: optional larger battery module</w:t>
             </w:r>
           </w:p>
         </w:tc>
@@ -2468,7 +2495,7 @@
                 <w:i w:val="0"/>
                 <w:sz w:val="32"/>
               </w:rPr>
-              <w:t>baseline เดียวกับ production</w:t>
+              <w:t>ใช้ core module เดียวกัน</w:t>
             </w:r>
           </w:p>
         </w:tc>
@@ -2902,7 +2929,7 @@
                 <w:i w:val="0"/>
                 <w:sz w:val="32"/>
               </w:rPr>
-              <w:t>18650 Battery x2</w:t>
+              <w:t>18650 Battery x2 (Standard baseline)</w:t>
             </w:r>
           </w:p>
         </w:tc>
@@ -2952,7 +2979,7 @@
                 <w:i w:val="0"/>
                 <w:sz w:val="32"/>
               </w:rPr>
-              <w:t>Battery holder + charger (TP4056)</w:t>
+              <w:t>Long-Life battery cells / module (optional upgrade)</w:t>
             </w:r>
           </w:p>
         </w:tc>
@@ -2968,7 +2995,7 @@
                 <w:i w:val="0"/>
                 <w:sz w:val="32"/>
               </w:rPr>
-              <w:t>80</w:t>
+              <w:t>1,200-1,500+</w:t>
             </w:r>
           </w:p>
         </w:tc>
@@ -2984,7 +3011,7 @@
                 <w:i w:val="0"/>
                 <w:sz w:val="32"/>
               </w:rPr>
-              <w:t>LCSC / Shopee</w:t>
+              <w:t>ร้านไทย / Shopee / custom pack</w:t>
             </w:r>
           </w:p>
         </w:tc>
@@ -3002,7 +3029,7 @@
                 <w:i w:val="0"/>
                 <w:sz w:val="32"/>
               </w:rPr>
-              <w:t>Bulk capacitor 470µF</w:t>
+              <w:t>Battery holder + charger (TP4056)</w:t>
             </w:r>
           </w:p>
         </w:tc>
@@ -3018,7 +3045,7 @@
                 <w:i w:val="0"/>
                 <w:sz w:val="32"/>
               </w:rPr>
-              <w:t>10</w:t>
+              <w:t>80</w:t>
             </w:r>
           </w:p>
         </w:tc>
@@ -3034,7 +3061,7 @@
                 <w:i w:val="0"/>
                 <w:sz w:val="32"/>
               </w:rPr>
-              <w:t>LCSC / บางลำพู</w:t>
+              <w:t>LCSC / Shopee</w:t>
             </w:r>
           </w:p>
         </w:tc>
@@ -3052,7 +3079,7 @@
                 <w:i w:val="0"/>
                 <w:sz w:val="32"/>
               </w:rPr>
-              <w:t>PCB (custom, qty 100)</w:t>
+              <w:t>Bulk capacitor 470µF</w:t>
             </w:r>
           </w:p>
         </w:tc>
@@ -3068,7 +3095,7 @@
                 <w:i w:val="0"/>
                 <w:sz w:val="32"/>
               </w:rPr>
-              <w:t>60</w:t>
+              <w:t>10</w:t>
             </w:r>
           </w:p>
         </w:tc>
@@ -3084,7 +3111,7 @@
                 <w:i w:val="0"/>
                 <w:sz w:val="32"/>
               </w:rPr>
-              <w:t>JLCPCB</w:t>
+              <w:t>LCSC / บางลำพู</w:t>
             </w:r>
           </w:p>
         </w:tc>
@@ -3102,7 +3129,7 @@
                 <w:i w:val="0"/>
                 <w:sz w:val="32"/>
               </w:rPr>
-              <w:t>Enclosure IP67 (3D print จากร้านรับ print - ASA/PC)</w:t>
+              <w:t>PCB (custom, qty 100)</w:t>
             </w:r>
           </w:p>
         </w:tc>
@@ -3118,7 +3145,7 @@
                 <w:i w:val="0"/>
                 <w:sz w:val="32"/>
               </w:rPr>
-              <w:t>200-400</w:t>
+              <w:t>60</w:t>
             </w:r>
           </w:p>
         </w:tc>
@@ -3134,7 +3161,7 @@
                 <w:i w:val="0"/>
                 <w:sz w:val="32"/>
               </w:rPr>
-              <w:t>ร้านรับ print 3D ในไทย</w:t>
+              <w:t>JLCPCB</w:t>
             </w:r>
           </w:p>
         </w:tc>
@@ -3152,7 +3179,7 @@
                 <w:i w:val="0"/>
                 <w:sz w:val="32"/>
               </w:rPr>
-              <w:t>Cable glands, connectors, wiring</w:t>
+              <w:t>Enclosure IP67 (3D print จากร้านรับ print - ASA/PC)</w:t>
             </w:r>
           </w:p>
         </w:tc>
@@ -3168,7 +3195,7 @@
                 <w:i w:val="0"/>
                 <w:sz w:val="32"/>
               </w:rPr>
-              <w:t>100</w:t>
+              <w:t>200-400</w:t>
             </w:r>
           </w:p>
         </w:tc>
@@ -3184,7 +3211,7 @@
                 <w:i w:val="0"/>
                 <w:sz w:val="32"/>
               </w:rPr>
-              <w:t>ร้านไทย</w:t>
+              <w:t>ร้านรับ print 3D ในไทย</w:t>
             </w:r>
           </w:p>
         </w:tc>
@@ -3202,7 +3229,7 @@
                 <w:i w:val="0"/>
                 <w:sz w:val="32"/>
               </w:rPr>
-              <w:t>SIM card slot + antenna</w:t>
+              <w:t>Cable glands, connectors, wiring</w:t>
             </w:r>
           </w:p>
         </w:tc>
@@ -3218,7 +3245,7 @@
                 <w:i w:val="0"/>
                 <w:sz w:val="32"/>
               </w:rPr>
-              <w:t>80</w:t>
+              <w:t>100</w:t>
             </w:r>
           </w:p>
         </w:tc>
@@ -3234,7 +3261,7 @@
                 <w:i w:val="0"/>
                 <w:sz w:val="32"/>
               </w:rPr>
-              <w:t>LCSC</w:t>
+              <w:t>ร้านไทย</w:t>
             </w:r>
           </w:p>
         </w:tc>
@@ -3252,7 +3279,7 @@
                 <w:i w:val="0"/>
                 <w:sz w:val="32"/>
               </w:rPr>
-              <w:t>Misc (resistors, MOSFET, LDO, etc.)</w:t>
+              <w:t>SIM card slot + antenna</w:t>
             </w:r>
           </w:p>
         </w:tc>
@@ -3268,7 +3295,7 @@
                 <w:i w:val="0"/>
                 <w:sz w:val="32"/>
               </w:rPr>
-              <w:t>60</w:t>
+              <w:t>80</w:t>
             </w:r>
           </w:p>
         </w:tc>
@@ -3284,7 +3311,7 @@
                 <w:i w:val="0"/>
                 <w:sz w:val="32"/>
               </w:rPr>
-              <w:t>LCSC / บางลำพู</w:t>
+              <w:t>LCSC</w:t>
             </w:r>
           </w:p>
         </w:tc>
@@ -3302,7 +3329,57 @@
                 <w:i w:val="0"/>
                 <w:sz w:val="32"/>
               </w:rPr>
-              <w:t>Total BOM</w:t>
+              <w:t>Misc (resistors, MOSFET, LDO, etc.)</w:t>
+            </w:r>
+          </w:p>
+        </w:tc>
+        <w:tc>
+          <w:tcPr>
+            <w:tcW w:type="dxa" w:w="3009"/>
+          </w:tcPr>
+          <w:p>
+            <w:r>
+              <w:rPr>
+                <w:rFonts w:ascii="TH Sarabun New" w:hAnsi="TH Sarabun New" w:eastAsia="TH Sarabun New" w:cs="TH Sarabun New"/>
+                <w:b w:val="0"/>
+                <w:i w:val="0"/>
+                <w:sz w:val="32"/>
+              </w:rPr>
+              <w:t>60</w:t>
+            </w:r>
+          </w:p>
+        </w:tc>
+        <w:tc>
+          <w:tcPr>
+            <w:tcW w:type="dxa" w:w="3009"/>
+          </w:tcPr>
+          <w:p>
+            <w:r>
+              <w:rPr>
+                <w:rFonts w:ascii="TH Sarabun New" w:hAnsi="TH Sarabun New" w:eastAsia="TH Sarabun New" w:cs="TH Sarabun New"/>
+                <w:b w:val="0"/>
+                <w:i w:val="0"/>
+                <w:sz w:val="32"/>
+              </w:rPr>
+              <w:t>LCSC / บางลำพู</w:t>
+            </w:r>
+          </w:p>
+        </w:tc>
+      </w:tr>
+      <w:tr>
+        <w:tc>
+          <w:tcPr>
+            <w:tcW w:type="dxa" w:w="3009"/>
+          </w:tcPr>
+          <w:p>
+            <w:r>
+              <w:rPr>
+                <w:rFonts w:ascii="TH Sarabun New" w:hAnsi="TH Sarabun New" w:eastAsia="TH Sarabun New" w:cs="TH Sarabun New"/>
+                <w:b w:val="0"/>
+                <w:i w:val="0"/>
+                <w:sz w:val="32"/>
+              </w:rPr>
+              <w:t>Total BOM (Standard)</w:t>
             </w:r>
           </w:p>
         </w:tc>

</xml_diff>

<commit_message>
Add Long-Life SKU details across SB-00 planning docs
</commit_message>
<xml_diff>
--- a/doc/human/SB-00_Business_Roadmap_v1_1.docx
+++ b/doc/human/SB-00_Business_Roadmap_v1_1.docx
@@ -301,7 +301,7 @@
                 <w:i w:val="0"/>
                 <w:sz w:val="32"/>
               </w:rPr>
-              <w:t>Hardware</w:t>
+              <w:t>Hardware Standard</w:t>
             </w:r>
           </w:p>
         </w:tc>
@@ -317,7 +317,7 @@
                 <w:i w:val="0"/>
                 <w:sz w:val="32"/>
               </w:rPr>
-              <w:t>SB-00 Node (เครื่อง + sensors + enclosure)</w:t>
+              <w:t>SB-00 Node Standard (เครื่อง + sensors + enclosure)</w:t>
             </w:r>
           </w:p>
         </w:tc>
@@ -366,6 +366,88 @@
                 <w:sz w:val="32"/>
               </w:rPr>
               <w:t>39-54%</w:t>
+            </w:r>
+          </w:p>
+        </w:tc>
+      </w:tr>
+      <w:tr>
+        <w:tc>
+          <w:tcPr>
+            <w:tcW w:type="dxa" w:w="1805"/>
+          </w:tcPr>
+          <w:p>
+            <w:r>
+              <w:rPr>
+                <w:rFonts w:ascii="TH Sarabun New" w:hAnsi="TH Sarabun New" w:eastAsia="TH Sarabun New" w:cs="TH Sarabun New"/>
+                <w:b w:val="0"/>
+                <w:i w:val="0"/>
+                <w:sz w:val="32"/>
+              </w:rPr>
+              <w:t>Hardware Long-Life</w:t>
+            </w:r>
+          </w:p>
+        </w:tc>
+        <w:tc>
+          <w:tcPr>
+            <w:tcW w:type="dxa" w:w="1805"/>
+          </w:tcPr>
+          <w:p>
+            <w:r>
+              <w:rPr>
+                <w:rFonts w:ascii="TH Sarabun New" w:hAnsi="TH Sarabun New" w:eastAsia="TH Sarabun New" w:cs="TH Sarabun New"/>
+                <w:b w:val="0"/>
+                <w:i w:val="0"/>
+                <w:sz w:val="32"/>
+              </w:rPr>
+              <w:t>SB-00 Node Long-Life (เครื่อง + sensors + enclosure + battery module ใหญ่ขึ้น)</w:t>
+            </w:r>
+          </w:p>
+        </w:tc>
+        <w:tc>
+          <w:tcPr>
+            <w:tcW w:type="dxa" w:w="1805"/>
+          </w:tcPr>
+          <w:p>
+            <w:r>
+              <w:rPr>
+                <w:rFonts w:ascii="TH Sarabun New" w:hAnsi="TH Sarabun New" w:eastAsia="TH Sarabun New" w:cs="TH Sarabun New"/>
+                <w:b w:val="0"/>
+                <w:i w:val="0"/>
+                <w:sz w:val="32"/>
+              </w:rPr>
+              <w:t>6,500-9,000+ THB/unit</w:t>
+            </w:r>
+          </w:p>
+        </w:tc>
+        <w:tc>
+          <w:tcPr>
+            <w:tcW w:type="dxa" w:w="1805"/>
+          </w:tcPr>
+          <w:p>
+            <w:r>
+              <w:rPr>
+                <w:rFonts w:ascii="TH Sarabun New" w:hAnsi="TH Sarabun New" w:eastAsia="TH Sarabun New" w:cs="TH Sarabun New"/>
+                <w:b w:val="0"/>
+                <w:i w:val="0"/>
+                <w:sz w:val="32"/>
+              </w:rPr>
+              <w:t>TBD หลังปิด BOM</w:t>
+            </w:r>
+          </w:p>
+        </w:tc>
+        <w:tc>
+          <w:tcPr>
+            <w:tcW w:type="dxa" w:w="1805"/>
+          </w:tcPr>
+          <w:p>
+            <w:r>
+              <w:rPr>
+                <w:rFonts w:ascii="TH Sarabun New" w:hAnsi="TH Sarabun New" w:eastAsia="TH Sarabun New" w:cs="TH Sarabun New"/>
+                <w:b w:val="0"/>
+                <w:i w:val="0"/>
+                <w:sz w:val="32"/>
+              </w:rPr>
+              <w:t>TBD</w:t>
             </w:r>
           </w:p>
         </w:tc>
@@ -3522,6 +3604,302 @@
         <w:t xml:space="preserve"> Margin: ขาย 4,500-6,000 THB → gross margin ประมาณ 36-55% ก่อนหัก overhead ขึ้นกับ enclosure final size และต้นทุน production จริง - ที่ batch 500+ ชิ้น BOM ลดได้อีก ~15% จาก volume discount</w:t>
       </w:r>
     </w:p>
+    <w:p/>
+    <w:p>
+      <w:pPr>
+        <w:pStyle w:val="Heading3"/>
+      </w:pPr>
+      <w:r>
+        <w:rPr>
+          <w:rFonts w:ascii="TH Sarabun New" w:hAnsi="TH Sarabun New" w:eastAsia="TH Sarabun New" w:cs="TH Sarabun New"/>
+          <w:b/>
+          <w:i w:val="0"/>
+          <w:sz w:val="32"/>
+        </w:rPr>
+        <w:t>SKU Strategy</w:t>
+      </w:r>
+    </w:p>
+    <w:p/>
+    <w:tbl>
+      <w:tblPr>
+        <w:tblStyle w:val="TableGrid"/>
+        <w:tblW w:type="auto" w:w="0"/>
+        <w:tblLayout w:type="autofit"/>
+        <w:tblLook w:firstColumn="1" w:firstRow="1" w:lastColumn="0" w:lastRow="0" w:noHBand="0" w:noVBand="1" w:val="04A0"/>
+      </w:tblPr>
+      <w:tblGrid>
+        <w:gridCol w:w="1805"/>
+        <w:gridCol w:w="1805"/>
+        <w:gridCol w:w="1805"/>
+        <w:gridCol w:w="1805"/>
+        <w:gridCol w:w="1805"/>
+      </w:tblGrid>
+      <w:tr>
+        <w:tc>
+          <w:tcPr>
+            <w:tcW w:type="dxa" w:w="1805"/>
+          </w:tcPr>
+          <w:p>
+            <w:r>
+              <w:rPr>
+                <w:rFonts w:ascii="TH Sarabun New" w:hAnsi="TH Sarabun New" w:eastAsia="TH Sarabun New" w:cs="TH Sarabun New"/>
+                <w:b/>
+                <w:i w:val="0"/>
+                <w:sz w:val="32"/>
+              </w:rPr>
+              <w:t>SKU</w:t>
+            </w:r>
+          </w:p>
+        </w:tc>
+        <w:tc>
+          <w:tcPr>
+            <w:tcW w:type="dxa" w:w="1805"/>
+          </w:tcPr>
+          <w:p>
+            <w:r>
+              <w:rPr>
+                <w:rFonts w:ascii="TH Sarabun New" w:hAnsi="TH Sarabun New" w:eastAsia="TH Sarabun New" w:cs="TH Sarabun New"/>
+                <w:b/>
+                <w:i w:val="0"/>
+                <w:sz w:val="32"/>
+              </w:rPr>
+              <w:t>Positioning</w:t>
+            </w:r>
+          </w:p>
+        </w:tc>
+        <w:tc>
+          <w:tcPr>
+            <w:tcW w:type="dxa" w:w="1805"/>
+          </w:tcPr>
+          <w:p>
+            <w:r>
+              <w:rPr>
+                <w:rFonts w:ascii="TH Sarabun New" w:hAnsi="TH Sarabun New" w:eastAsia="TH Sarabun New" w:cs="TH Sarabun New"/>
+                <w:b/>
+                <w:i w:val="0"/>
+                <w:sz w:val="32"/>
+              </w:rPr>
+              <w:t>Battery</w:t>
+            </w:r>
+          </w:p>
+        </w:tc>
+        <w:tc>
+          <w:tcPr>
+            <w:tcW w:type="dxa" w:w="1805"/>
+          </w:tcPr>
+          <w:p>
+            <w:r>
+              <w:rPr>
+                <w:rFonts w:ascii="TH Sarabun New" w:hAnsi="TH Sarabun New" w:eastAsia="TH Sarabun New" w:cs="TH Sarabun New"/>
+                <w:b/>
+                <w:i w:val="0"/>
+                <w:sz w:val="32"/>
+              </w:rPr>
+              <w:t>Runtime target</w:t>
+            </w:r>
+          </w:p>
+        </w:tc>
+        <w:tc>
+          <w:tcPr>
+            <w:tcW w:type="dxa" w:w="1805"/>
+          </w:tcPr>
+          <w:p>
+            <w:r>
+              <w:rPr>
+                <w:rFonts w:ascii="TH Sarabun New" w:hAnsi="TH Sarabun New" w:eastAsia="TH Sarabun New" w:cs="TH Sarabun New"/>
+                <w:b/>
+                <w:i w:val="0"/>
+                <w:sz w:val="32"/>
+              </w:rPr>
+              <w:t>หมายเหตุ</w:t>
+            </w:r>
+          </w:p>
+        </w:tc>
+      </w:tr>
+      <w:tr>
+        <w:tc>
+          <w:tcPr>
+            <w:tcW w:type="dxa" w:w="1805"/>
+          </w:tcPr>
+          <w:p>
+            <w:r>
+              <w:rPr>
+                <w:rFonts w:ascii="TH Sarabun New" w:hAnsi="TH Sarabun New" w:eastAsia="TH Sarabun New" w:cs="TH Sarabun New"/>
+                <w:b w:val="0"/>
+                <w:i w:val="0"/>
+                <w:sz w:val="32"/>
+              </w:rPr>
+              <w:t>Standard</w:t>
+            </w:r>
+          </w:p>
+        </w:tc>
+        <w:tc>
+          <w:tcPr>
+            <w:tcW w:type="dxa" w:w="1805"/>
+          </w:tcPr>
+          <w:p>
+            <w:r>
+              <w:rPr>
+                <w:rFonts w:ascii="TH Sarabun New" w:hAnsi="TH Sarabun New" w:eastAsia="TH Sarabun New" w:cs="TH Sarabun New"/>
+                <w:b w:val="0"/>
+                <w:i w:val="0"/>
+                <w:sz w:val="32"/>
+              </w:rPr>
+              <w:t>รุ่นหลัก</w:t>
+            </w:r>
+          </w:p>
+        </w:tc>
+        <w:tc>
+          <w:tcPr>
+            <w:tcW w:type="dxa" w:w="1805"/>
+          </w:tcPr>
+          <w:p>
+            <w:r>
+              <w:rPr>
+                <w:rFonts w:ascii="TH Sarabun New" w:hAnsi="TH Sarabun New" w:eastAsia="TH Sarabun New" w:cs="TH Sarabun New"/>
+                <w:b w:val="0"/>
+                <w:i w:val="0"/>
+                <w:sz w:val="32"/>
+              </w:rPr>
+              <w:t>18650 x2 baseline</w:t>
+            </w:r>
+          </w:p>
+        </w:tc>
+        <w:tc>
+          <w:tcPr>
+            <w:tcW w:type="dxa" w:w="1805"/>
+          </w:tcPr>
+          <w:p>
+            <w:r>
+              <w:rPr>
+                <w:rFonts w:ascii="Consolas" w:hAnsi="Consolas" w:eastAsia="Consolas" w:cs="Consolas"/>
+                <w:b w:val="0"/>
+                <w:i w:val="0"/>
+                <w:sz w:val="20"/>
+              </w:rPr>
+              <w:t>&gt;= 12 วัน @ 5 นาที</w:t>
+            </w:r>
+          </w:p>
+        </w:tc>
+        <w:tc>
+          <w:tcPr>
+            <w:tcW w:type="dxa" w:w="1805"/>
+          </w:tcPr>
+          <w:p>
+            <w:r>
+              <w:rPr>
+                <w:rFonts w:ascii="TH Sarabun New" w:hAnsi="TH Sarabun New" w:eastAsia="TH Sarabun New" w:cs="TH Sarabun New"/>
+                <w:b w:val="0"/>
+                <w:i w:val="0"/>
+                <w:sz w:val="32"/>
+              </w:rPr>
+              <w:t>ใช้ baseline pricing/cogs ปัจจุบัน</w:t>
+            </w:r>
+          </w:p>
+        </w:tc>
+      </w:tr>
+      <w:tr>
+        <w:tc>
+          <w:tcPr>
+            <w:tcW w:type="dxa" w:w="1805"/>
+          </w:tcPr>
+          <w:p>
+            <w:r>
+              <w:rPr>
+                <w:rFonts w:ascii="TH Sarabun New" w:hAnsi="TH Sarabun New" w:eastAsia="TH Sarabun New" w:cs="TH Sarabun New"/>
+                <w:b w:val="0"/>
+                <w:i w:val="0"/>
+                <w:sz w:val="32"/>
+              </w:rPr>
+              <w:t>Long-Life</w:t>
+            </w:r>
+          </w:p>
+        </w:tc>
+        <w:tc>
+          <w:tcPr>
+            <w:tcW w:type="dxa" w:w="1805"/>
+          </w:tcPr>
+          <w:p>
+            <w:r>
+              <w:rPr>
+                <w:rFonts w:ascii="TH Sarabun New" w:hAnsi="TH Sarabun New" w:eastAsia="TH Sarabun New" w:cs="TH Sarabun New"/>
+                <w:b w:val="0"/>
+                <w:i w:val="0"/>
+                <w:sz w:val="32"/>
+              </w:rPr>
+              <w:t>รุ่นอัปเกรด</w:t>
+            </w:r>
+          </w:p>
+        </w:tc>
+        <w:tc>
+          <w:tcPr>
+            <w:tcW w:type="dxa" w:w="1805"/>
+          </w:tcPr>
+          <w:p>
+            <w:r>
+              <w:rPr>
+                <w:rFonts w:ascii="TH Sarabun New" w:hAnsi="TH Sarabun New" w:eastAsia="TH Sarabun New" w:cs="TH Sarabun New"/>
+                <w:b w:val="0"/>
+                <w:i w:val="0"/>
+                <w:sz w:val="32"/>
+              </w:rPr>
+              <w:t>battery module ใหญ่ขึ้น</w:t>
+            </w:r>
+          </w:p>
+        </w:tc>
+        <w:tc>
+          <w:tcPr>
+            <w:tcW w:type="dxa" w:w="1805"/>
+          </w:tcPr>
+          <w:p>
+            <w:r>
+              <w:rPr>
+                <w:rFonts w:ascii="Consolas" w:hAnsi="Consolas" w:eastAsia="Consolas" w:cs="Consolas"/>
+                <w:b w:val="0"/>
+                <w:i w:val="0"/>
+                <w:sz w:val="20"/>
+              </w:rPr>
+              <w:t>&gt;= 30 วัน @ 5 นาที</w:t>
+            </w:r>
+            <w:r>
+              <w:rPr>
+                <w:rFonts w:ascii="TH Sarabun New" w:hAnsi="TH Sarabun New" w:eastAsia="TH Sarabun New" w:cs="TH Sarabun New"/>
+                <w:b w:val="0"/>
+                <w:i w:val="0"/>
+                <w:sz w:val="32"/>
+              </w:rPr>
+              <w:t xml:space="preserve"> หรือ </w:t>
+            </w:r>
+            <w:r>
+              <w:rPr>
+                <w:rFonts w:ascii="Consolas" w:hAnsi="Consolas" w:eastAsia="Consolas" w:cs="Consolas"/>
+                <w:b w:val="0"/>
+                <w:i w:val="0"/>
+                <w:sz w:val="20"/>
+              </w:rPr>
+              <w:t>&gt;= 60 วัน @ 10 นาที</w:t>
+            </w:r>
+          </w:p>
+        </w:tc>
+        <w:tc>
+          <w:tcPr>
+            <w:tcW w:type="dxa" w:w="1805"/>
+          </w:tcPr>
+          <w:p>
+            <w:r>
+              <w:rPr>
+                <w:rFonts w:ascii="TH Sarabun New" w:hAnsi="TH Sarabun New" w:eastAsia="TH Sarabun New" w:cs="TH Sarabun New"/>
+                <w:b w:val="0"/>
+                <w:i w:val="0"/>
+                <w:sz w:val="32"/>
+              </w:rPr>
+              <w:t>final price/cogs ปิดหลัง battery pack + enclosure spec ชัด</w:t>
+            </w:r>
+          </w:p>
+        </w:tc>
+      </w:tr>
+    </w:tbl>
+    <w:p/>
     <w:p/>
     <w:p>
       <w:pPr>

</xml_diff>